<commit_message>
Update green facilitator from action to propsal
</commit_message>
<xml_diff>
--- a/The action modal must have the following details.docx
+++ b/The action modal must have the following details.docx
@@ -19,13 +19,11 @@
     </w:p>
     <w:p>
       <w:r>
-        <w:t>3. Policy Tool - (</w:t>
+        <w:t>3. Policy Tool - (Diplomati</w:t>
       </w:r>
-      <w:proofErr w:type="spellStart"/>
       <w:r>
-        <w:t>Diplomative</w:t>
+        <w:t>c</w:t>
       </w:r>
-      <w:proofErr w:type="spellEnd"/>
       <w:r>
         <w:t>, Informational, Military, Economic)</w:t>
       </w:r>

</xml_diff>